<commit_message>
chgk: the template chgksuite ships today
Ours was an older copy: it asks for Arial and embeds no faces, where
theirs asks for Noto Sans and embeds four. So an exported .docx named a
different font than the same export from chgksuite.

Costs 436 KB per file. Body parity holds in every language.
</commit_message>
<xml_diff>
--- a/xy/internal/chgk/docx/assets/template.docx
+++ b/xy/internal/chgk/docx/assets/template.docx
@@ -479,7 +479,7 @@
       <w:jc w:val="left"/>
     </w:pPr>
     <w:rPr>
-      <w:rFonts w:ascii="Arial" w:hAnsi="Arial" w:eastAsia="" w:cs="Times New Roman" w:eastAsiaTheme="minorEastAsia"/>
+      <w:rFonts w:ascii="Noto Sans" w:hAnsi="Noto Sans" w:eastAsia="" w:cs="Times New Roman" w:eastAsiaTheme="minorEastAsia"/>
       <w:color w:val="auto"/>
       <w:kern w:val="0"/>
       <w:sz w:val="24"/>
@@ -501,7 +501,7 @@
       <w:outlineLvl w:val="0"/>
     </w:pPr>
     <w:rPr>
-      <w:rFonts w:ascii="Arial" w:hAnsi="Arial" w:eastAsia="" w:asciiTheme="majorHAnsi" w:eastAsiaTheme="majorEastAsia" w:hAnsiTheme="majorHAnsi"/>
+      <w:rFonts w:ascii="Noto Sans" w:hAnsi="Noto Sans" w:eastAsia="" w:asciiTheme="majorHAnsi" w:eastAsiaTheme="majorEastAsia" w:hAnsiTheme="majorHAnsi"/>
       <w:b/>
       <w:bCs/>
       <w:kern w:val="2"/>
@@ -525,7 +525,7 @@
       <w:outlineLvl w:val="1"/>
     </w:pPr>
     <w:rPr>
-      <w:rFonts w:ascii="Arial" w:hAnsi="Arial" w:eastAsia="" w:asciiTheme="majorHAnsi" w:eastAsiaTheme="majorEastAsia" w:hAnsiTheme="majorHAnsi"/>
+      <w:rFonts w:ascii="Noto Sans" w:hAnsi="Noto Sans" w:eastAsia="" w:asciiTheme="majorHAnsi" w:eastAsiaTheme="majorEastAsia" w:hAnsiTheme="majorHAnsi"/>
       <w:b/>
       <w:bCs/>
       <w:i/>
@@ -550,7 +550,7 @@
       <w:outlineLvl w:val="2"/>
     </w:pPr>
     <w:rPr>
-      <w:rFonts w:ascii="Arial" w:hAnsi="Arial" w:eastAsia="" w:asciiTheme="majorHAnsi" w:eastAsiaTheme="majorEastAsia" w:hAnsiTheme="majorHAnsi"/>
+      <w:rFonts w:ascii="Noto Sans" w:hAnsi="Noto Sans" w:eastAsia="" w:asciiTheme="majorHAnsi" w:eastAsiaTheme="majorEastAsia" w:hAnsiTheme="majorHAnsi"/>
       <w:b/>
       <w:bCs/>
       <w:sz w:val="26"/>
@@ -673,7 +673,7 @@
       <w:outlineLvl w:val="8"/>
     </w:pPr>
     <w:rPr>
-      <w:rFonts w:ascii="Arial" w:hAnsi="Arial" w:eastAsia="" w:asciiTheme="majorHAnsi" w:eastAsiaTheme="majorEastAsia" w:hAnsiTheme="majorHAnsi"/>
+      <w:rFonts w:ascii="Noto Sans" w:hAnsi="Noto Sans" w:eastAsia="" w:asciiTheme="majorHAnsi" w:eastAsiaTheme="majorEastAsia" w:hAnsiTheme="majorHAnsi"/>
       <w:sz w:val="22"/>
       <w:szCs w:val="22"/>
     </w:rPr>
@@ -694,7 +694,7 @@
     <w:qFormat/>
     <w:rsid w:val="003c7a06"/>
     <w:rPr>
-      <w:rFonts w:ascii="Arial" w:hAnsi="Arial" w:eastAsia="" w:asciiTheme="majorHAnsi" w:eastAsiaTheme="majorEastAsia" w:hAnsiTheme="majorHAnsi"/>
+      <w:rFonts w:ascii="Noto Sans" w:hAnsi="Noto Sans" w:eastAsia="" w:asciiTheme="majorHAnsi" w:eastAsiaTheme="majorEastAsia" w:hAnsiTheme="majorHAnsi"/>
       <w:b/>
       <w:bCs/>
       <w:kern w:val="2"/>
@@ -711,7 +711,7 @@
     <w:qFormat/>
     <w:rsid w:val="003c7a06"/>
     <w:rPr>
-      <w:rFonts w:ascii="Arial" w:hAnsi="Arial" w:eastAsia="" w:asciiTheme="majorHAnsi" w:eastAsiaTheme="majorEastAsia" w:hAnsiTheme="majorHAnsi"/>
+      <w:rFonts w:ascii="Noto Sans" w:hAnsi="Noto Sans" w:eastAsia="" w:asciiTheme="majorHAnsi" w:eastAsiaTheme="majorEastAsia" w:hAnsiTheme="majorHAnsi"/>
       <w:b/>
       <w:bCs/>
       <w:i/>
@@ -729,7 +729,7 @@
     <w:qFormat/>
     <w:rsid w:val="003c7a06"/>
     <w:rPr>
-      <w:rFonts w:ascii="Arial" w:hAnsi="Arial" w:eastAsia="" w:asciiTheme="majorHAnsi" w:eastAsiaTheme="majorEastAsia" w:hAnsiTheme="majorHAnsi"/>
+      <w:rFonts w:ascii="Noto Sans" w:hAnsi="Noto Sans" w:eastAsia="" w:asciiTheme="majorHAnsi" w:eastAsiaTheme="majorEastAsia" w:hAnsiTheme="majorHAnsi"/>
       <w:b/>
       <w:bCs/>
       <w:sz w:val="26"/>
@@ -818,7 +818,7 @@
     <w:qFormat/>
     <w:rsid w:val="003c7a06"/>
     <w:rPr>
-      <w:rFonts w:ascii="Arial" w:hAnsi="Arial" w:eastAsia="" w:asciiTheme="majorHAnsi" w:eastAsiaTheme="majorEastAsia" w:hAnsiTheme="majorHAnsi"/>
+      <w:rFonts w:ascii="Noto Sans" w:hAnsi="Noto Sans" w:eastAsia="" w:asciiTheme="majorHAnsi" w:eastAsiaTheme="majorEastAsia" w:hAnsiTheme="majorHAnsi"/>
     </w:rPr>
   </w:style>
   <w:style w:type="character" w:styleId="TitleChar" w:customStyle="1">
@@ -829,7 +829,7 @@
     <w:qFormat/>
     <w:rsid w:val="003c7a06"/>
     <w:rPr>
-      <w:rFonts w:ascii="Arial" w:hAnsi="Arial" w:eastAsia="" w:asciiTheme="majorHAnsi" w:eastAsiaTheme="majorEastAsia" w:hAnsiTheme="majorHAnsi"/>
+      <w:rFonts w:ascii="Noto Sans" w:hAnsi="Noto Sans" w:eastAsia="" w:asciiTheme="majorHAnsi" w:eastAsiaTheme="majorEastAsia" w:hAnsiTheme="majorHAnsi"/>
       <w:b/>
       <w:bCs/>
       <w:kern w:val="2"/>
@@ -845,7 +845,7 @@
     <w:qFormat/>
     <w:rsid w:val="003c7a06"/>
     <w:rPr>
-      <w:rFonts w:ascii="Arial" w:hAnsi="Arial" w:eastAsia="" w:asciiTheme="majorHAnsi" w:eastAsiaTheme="majorEastAsia" w:hAnsiTheme="majorHAnsi"/>
+      <w:rFonts w:ascii="Noto Sans" w:hAnsi="Noto Sans" w:eastAsia="" w:asciiTheme="majorHAnsi" w:eastAsiaTheme="majorEastAsia" w:hAnsiTheme="majorHAnsi"/>
       <w:sz w:val="24"/>
       <w:szCs w:val="24"/>
     </w:rPr>
@@ -955,7 +955,7 @@
     <w:qFormat/>
     <w:rsid w:val="003c7a06"/>
     <w:rPr>
-      <w:rFonts w:ascii="Arial" w:hAnsi="Arial" w:eastAsia="" w:asciiTheme="majorHAnsi" w:eastAsiaTheme="majorEastAsia" w:hAnsiTheme="majorHAnsi"/>
+      <w:rFonts w:ascii="Noto Sans" w:hAnsi="Noto Sans" w:eastAsia="" w:asciiTheme="majorHAnsi" w:eastAsiaTheme="majorEastAsia" w:hAnsiTheme="majorHAnsi"/>
       <w:b/>
       <w:i/>
       <w:sz w:val="24"/>
@@ -1019,7 +1019,7 @@
       <w:spacing w:before="240" w:after="120"/>
     </w:pPr>
     <w:rPr>
-      <w:rFonts w:ascii="Liberation Sans" w:hAnsi="Liberation Sans" w:eastAsia="PingFang SC" w:cs="Arial Unicode MS"/>
+      <w:rFonts w:ascii="Liberation Sans" w:hAnsi="Liberation Sans" w:eastAsia="PingFang SC" w:cs="Noto Sans"/>
       <w:sz w:val="28"/>
       <w:szCs w:val="28"/>
     </w:rPr>
@@ -1037,7 +1037,7 @@
     <w:basedOn w:val="TextBody"/>
     <w:pPr/>
     <w:rPr>
-      <w:rFonts w:cs="Arial Unicode MS"/>
+      <w:rFonts w:cs="Noto Sans"/>
     </w:rPr>
   </w:style>
   <w:style w:type="paragraph" w:styleId="Caption">
@@ -1049,7 +1049,7 @@
       <w:spacing w:before="120" w:after="120"/>
     </w:pPr>
     <w:rPr>
-      <w:rFonts w:cs="Arial Unicode MS"/>
+      <w:rFonts w:cs="Noto Sans"/>
       <w:i/>
       <w:iCs/>
       <w:sz w:val="24"/>
@@ -1064,7 +1064,7 @@
       <w:suppressLineNumbers/>
     </w:pPr>
     <w:rPr>
-      <w:rFonts w:cs="Arial Unicode MS"/>
+      <w:rFonts w:cs="Noto Sans"/>
     </w:rPr>
   </w:style>
   <w:style w:type="paragraph" w:styleId="Title">
@@ -1081,7 +1081,7 @@
       <w:outlineLvl w:val="0"/>
     </w:pPr>
     <w:rPr>
-      <w:rFonts w:ascii="Arial" w:hAnsi="Arial" w:eastAsia="" w:asciiTheme="majorHAnsi" w:eastAsiaTheme="majorEastAsia" w:hAnsiTheme="majorHAnsi"/>
+      <w:rFonts w:ascii="Noto Sans" w:hAnsi="Noto Sans" w:eastAsia="" w:asciiTheme="majorHAnsi" w:eastAsiaTheme="majorEastAsia" w:hAnsiTheme="majorHAnsi"/>
       <w:b/>
       <w:bCs/>
       <w:kern w:val="2"/>
@@ -1103,7 +1103,7 @@
       <w:outlineLvl w:val="1"/>
     </w:pPr>
     <w:rPr>
-      <w:rFonts w:ascii="Arial" w:hAnsi="Arial" w:eastAsia="" w:asciiTheme="majorHAnsi" w:eastAsiaTheme="majorEastAsia" w:hAnsiTheme="majorHAnsi"/>
+      <w:rFonts w:ascii="Noto Sans" w:hAnsi="Noto Sans" w:eastAsia="" w:asciiTheme="majorHAnsi" w:eastAsiaTheme="majorEastAsia" w:hAnsiTheme="majorHAnsi"/>
     </w:rPr>
   </w:style>
   <w:style w:type="paragraph" w:styleId="NoSpacing">
@@ -1304,15 +1304,15 @@
     </a:clrScheme>
     <a:fontScheme name="Классическая">
       <a:majorFont>
-        <a:latin typeface="Arial"/>
+        <a:latin typeface="Noto Sans"/>
         <a:ea typeface=""/>
         <a:cs typeface=""/>
         <a:font script="Jpan" typeface="ＭＳ Ｐゴシック"/>
         <a:font script="Hang" typeface="돋움"/>
         <a:font script="Hans" typeface="黑体"/>
         <a:font script="Hant" typeface="微軟正黑體"/>
-        <a:font script="Arab" typeface="Arial"/>
-        <a:font script="Hebr" typeface="Arial"/>
+        <a:font script="Arab" typeface="Noto Sans"/>
+        <a:font script="Hebr" typeface="Noto Sans"/>
         <a:font script="Thai" typeface="Cordia New"/>
         <a:font script="Ethi" typeface="Nyala"/>
         <a:font script="Beng" typeface="Vrinda"/>
@@ -1334,7 +1334,7 @@
         <a:font script="Laoo" typeface="DokChampa"/>
         <a:font script="Sinh" typeface="Iskoola Pota"/>
         <a:font script="Mong" typeface="Mongolian Baiti"/>
-        <a:font script="Viet" typeface="Arial"/>
+        <a:font script="Viet" typeface="Noto Sans"/>
         <a:font script="Uigh" typeface="Microsoft Uighur"/>
         <a:font script="Geor" typeface="Sylfaen"/>
       </a:majorFont>

</xml_diff>